<commit_message>
feat trabajando con grid
</commit_message>
<xml_diff>
--- a/Css Flexbox.docx
+++ b/Css Flexbox.docx
@@ -13,7 +13,6 @@
           <w:szCs w:val="40"/>
         </w:rPr>
       </w:pPr>
-      <w:proofErr w:type="spellStart"/>
       <w:r>
         <w:rPr>
           <w:b/>
@@ -22,10 +21,12 @@
           <w:sz w:val="40"/>
           <w:szCs w:val="40"/>
         </w:rPr>
-        <w:t>Css</w:t>
-      </w:r>
-      <w:proofErr w:type="spellEnd"/>
-      <w:r>
+        <w:t>Css Flexbox</w:t>
+      </w:r>
+    </w:p>
+    <w:p>
+      <w:pPr>
+        <w:jc w:val="center"/>
         <w:rPr>
           <w:b/>
           <w:bCs/>
@@ -33,9 +34,7 @@
           <w:sz w:val="40"/>
           <w:szCs w:val="40"/>
         </w:rPr>
-        <w:t xml:space="preserve"> </w:t>
-      </w:r>
-      <w:proofErr w:type="spellStart"/>
+      </w:pPr>
       <w:r>
         <w:rPr>
           <w:b/>
@@ -44,12 +43,48 @@
           <w:sz w:val="40"/>
           <w:szCs w:val="40"/>
         </w:rPr>
-        <w:t>Flexbox</w:t>
-      </w:r>
-      <w:proofErr w:type="spellEnd"/>
+        <w:drawing>
+          <wp:inline distT="0" distB="0" distL="0" distR="0" wp14:anchorId="3A1FECE1" wp14:editId="656D045A">
+            <wp:extent cx="5400040" cy="4282440"/>
+            <wp:effectExtent l="0" t="0" r="0" b="3810"/>
+            <wp:docPr id="439512118" name="Imagen 1"/>
+            <wp:cNvGraphicFramePr>
+              <a:graphicFrameLocks xmlns:a="http://schemas.openxmlformats.org/drawingml/2006/main" noChangeAspect="1"/>
+            </wp:cNvGraphicFramePr>
+            <a:graphic xmlns:a="http://schemas.openxmlformats.org/drawingml/2006/main">
+              <a:graphicData uri="http://schemas.openxmlformats.org/drawingml/2006/picture">
+                <pic:pic xmlns:pic="http://schemas.openxmlformats.org/drawingml/2006/picture">
+                  <pic:nvPicPr>
+                    <pic:cNvPr id="439512118" name=""/>
+                    <pic:cNvPicPr/>
+                  </pic:nvPicPr>
+                  <pic:blipFill>
+                    <a:blip r:embed="rId4"/>
+                    <a:stretch>
+                      <a:fillRect/>
+                    </a:stretch>
+                  </pic:blipFill>
+                  <pic:spPr>
+                    <a:xfrm>
+                      <a:off x="0" y="0"/>
+                      <a:ext cx="5400040" cy="4282440"/>
+                    </a:xfrm>
+                    <a:prstGeom prst="rect">
+                      <a:avLst/>
+                    </a:prstGeom>
+                  </pic:spPr>
+                </pic:pic>
+              </a:graphicData>
+            </a:graphic>
+          </wp:inline>
+        </w:drawing>
+      </w:r>
     </w:p>
     <w:p>
       <w:r>
+        <w:rPr>
+          <w:noProof/>
+        </w:rPr>
         <w:drawing>
           <wp:inline distT="0" distB="0" distL="0" distR="0" wp14:anchorId="237C974B" wp14:editId="7DC4EA4A">
             <wp:extent cx="2076740" cy="200053"/>
@@ -66,7 +101,7 @@
                     <pic:cNvPicPr/>
                   </pic:nvPicPr>
                   <pic:blipFill>
-                    <a:blip r:embed="rId4"/>
+                    <a:blip r:embed="rId5"/>
                     <a:stretch>
                       <a:fillRect/>
                     </a:stretch>
@@ -95,16 +130,14 @@
       </w:r>
       <w:proofErr w:type="spellEnd"/>
       <w:r>
-        <w:t xml:space="preserve"> en el </w:t>
-      </w:r>
-      <w:proofErr w:type="spellStart"/>
-      <w:r>
-        <w:t>layout</w:t>
-      </w:r>
-      <w:proofErr w:type="spellEnd"/>
+        <w:t xml:space="preserve"> en el layout</w:t>
+      </w:r>
     </w:p>
     <w:p>
       <w:r>
+        <w:rPr>
+          <w:noProof/>
+        </w:rPr>
         <w:drawing>
           <wp:inline distT="0" distB="0" distL="0" distR="0" wp14:anchorId="2A6698BF" wp14:editId="3CFEB32D">
             <wp:extent cx="2572109" cy="200053"/>
@@ -121,7 +154,7 @@
                     <pic:cNvPicPr/>
                   </pic:nvPicPr>
                   <pic:blipFill>
-                    <a:blip r:embed="rId5"/>
+                    <a:blip r:embed="rId6"/>
                     <a:stretch>
                       <a:fillRect/>
                     </a:stretch>
@@ -147,6 +180,9 @@
     </w:p>
     <w:p>
       <w:r>
+        <w:rPr>
+          <w:noProof/>
+        </w:rPr>
         <w:drawing>
           <wp:inline distT="0" distB="0" distL="0" distR="0" wp14:anchorId="5F0E4529" wp14:editId="41800EC2">
             <wp:extent cx="2295845" cy="209579"/>
@@ -163,7 +199,7 @@
                     <pic:cNvPicPr/>
                   </pic:nvPicPr>
                   <pic:blipFill>
-                    <a:blip r:embed="rId6"/>
+                    <a:blip r:embed="rId7"/>
                     <a:stretch>
                       <a:fillRect/>
                     </a:stretch>
@@ -187,11 +223,11 @@
         <w:t xml:space="preserve"> </w:t>
       </w:r>
       <w:r>
-        <w:t xml:space="preserve">La propiedad </w:t>
+        <w:t>La propiedad flex-</w:t>
       </w:r>
       <w:proofErr w:type="spellStart"/>
       <w:r>
-        <w:t>flex-wrap</w:t>
+        <w:t>wrap</w:t>
       </w:r>
       <w:proofErr w:type="spellEnd"/>
       <w:r>
@@ -200,6 +236,9 @@
     </w:p>
     <w:p>
       <w:r>
+        <w:rPr>
+          <w:noProof/>
+        </w:rPr>
         <w:drawing>
           <wp:inline distT="0" distB="0" distL="0" distR="0" wp14:anchorId="12D6EF34" wp14:editId="5AA35B08">
             <wp:extent cx="1581371" cy="200053"/>
@@ -216,7 +255,7 @@
                     <pic:cNvPicPr/>
                   </pic:nvPicPr>
                   <pic:blipFill>
-                    <a:blip r:embed="rId7"/>
+                    <a:blip r:embed="rId8"/>
                     <a:stretch>
                       <a:fillRect/>
                     </a:stretch>
@@ -237,31 +276,15 @@
         </w:drawing>
       </w:r>
       <w:r>
-        <w:t xml:space="preserve"> Une las propiedades </w:t>
+        <w:t xml:space="preserve"> Une las propiedades flex </w:t>
       </w:r>
       <w:proofErr w:type="spellStart"/>
       <w:r>
-        <w:t>flex</w:t>
+        <w:t>direcction</w:t>
       </w:r>
       <w:proofErr w:type="spellEnd"/>
       <w:r>
-        <w:t xml:space="preserve"> </w:t>
-      </w:r>
-      <w:proofErr w:type="spellStart"/>
-      <w:r>
-        <w:t>direcction</w:t>
-      </w:r>
-      <w:proofErr w:type="spellEnd"/>
-      <w:r>
-        <w:t xml:space="preserve"> y </w:t>
-      </w:r>
-      <w:proofErr w:type="spellStart"/>
-      <w:r>
-        <w:t>flex</w:t>
-      </w:r>
-      <w:proofErr w:type="spellEnd"/>
-      <w:r>
-        <w:t xml:space="preserve"> </w:t>
+        <w:t xml:space="preserve"> y flex </w:t>
       </w:r>
       <w:proofErr w:type="spellStart"/>
       <w:r>
@@ -271,6 +294,9 @@
     </w:p>
     <w:p>
       <w:r>
+        <w:rPr>
+          <w:noProof/>
+        </w:rPr>
         <w:drawing>
           <wp:inline distT="0" distB="0" distL="0" distR="0" wp14:anchorId="7F588889" wp14:editId="027AFC44">
             <wp:extent cx="981212" cy="200053"/>
@@ -287,7 +313,7 @@
                     <pic:cNvPicPr/>
                   </pic:nvPicPr>
                   <pic:blipFill>
-                    <a:blip r:embed="rId8"/>
+                    <a:blip r:embed="rId9"/>
                     <a:stretch>
                       <a:fillRect/>
                     </a:stretch>
@@ -314,16 +340,14 @@
         <w:t xml:space="preserve"> da el tamaño, </w:t>
       </w:r>
       <w:r>
-        <w:t xml:space="preserve">se aplica a los elementos dentro del </w:t>
-      </w:r>
-      <w:proofErr w:type="spellStart"/>
-      <w:r>
-        <w:t>layout</w:t>
-      </w:r>
-      <w:proofErr w:type="spellEnd"/>
+        <w:t>se aplica a los elementos dentro del layout</w:t>
+      </w:r>
     </w:p>
     <w:p>
       <w:r>
+        <w:rPr>
+          <w:noProof/>
+        </w:rPr>
         <w:drawing>
           <wp:inline distT="0" distB="0" distL="0" distR="0" wp14:anchorId="72596EC3" wp14:editId="6BFB1663">
             <wp:extent cx="1124107" cy="228632"/>
@@ -340,7 +364,7 @@
                     <pic:cNvPicPr/>
                   </pic:nvPicPr>
                   <pic:blipFill>
-                    <a:blip r:embed="rId9"/>
+                    <a:blip r:embed="rId10"/>
                     <a:stretch>
                       <a:fillRect/>
                     </a:stretch>
@@ -361,19 +385,14 @@
         </w:drawing>
       </w:r>
       <w:r>
-        <w:t xml:space="preserve"> reduce los elementos, </w:t>
-      </w:r>
-      <w:r>
-        <w:t xml:space="preserve">se aplica a los elementos dentro del </w:t>
-      </w:r>
-      <w:proofErr w:type="spellStart"/>
-      <w:r>
-        <w:t>layout</w:t>
-      </w:r>
-      <w:proofErr w:type="spellEnd"/>
+        <w:t xml:space="preserve"> reduce los elementos, se aplica a los elementos dentro del layout</w:t>
+      </w:r>
     </w:p>
     <w:p>
       <w:r>
+        <w:rPr>
+          <w:noProof/>
+        </w:rPr>
         <w:drawing>
           <wp:inline distT="0" distB="0" distL="0" distR="0" wp14:anchorId="20A3A969" wp14:editId="41A6D7D8">
             <wp:extent cx="752580" cy="190527"/>
@@ -390,7 +409,7 @@
                     <pic:cNvPicPr/>
                   </pic:nvPicPr>
                   <pic:blipFill>
-                    <a:blip r:embed="rId10"/>
+                    <a:blip r:embed="rId11"/>
                     <a:stretch>
                       <a:fillRect/>
                     </a:stretch>
@@ -411,27 +430,15 @@
         </w:drawing>
       </w:r>
       <w:r>
-        <w:t xml:space="preserve"> Ordena los elementos dentro del </w:t>
-      </w:r>
-      <w:proofErr w:type="spellStart"/>
-      <w:r>
-        <w:t>layout</w:t>
-      </w:r>
-      <w:proofErr w:type="spellEnd"/>
-      <w:r>
-        <w:t xml:space="preserve">, </w:t>
-      </w:r>
-      <w:r>
-        <w:t xml:space="preserve">se aplica a los elementos dentro del </w:t>
-      </w:r>
-      <w:proofErr w:type="spellStart"/>
-      <w:r>
-        <w:t>layout</w:t>
-      </w:r>
-      <w:proofErr w:type="spellEnd"/>
+        <w:t xml:space="preserve"> Ordena los elementos dentro del layout, se aplica a los elementos dentro del layout</w:t>
+      </w:r>
     </w:p>
     <w:p>
       <w:r>
+        <w:rPr>
+          <w:noProof/>
+        </w:rPr>
+        <w:lastRenderedPageBreak/>
         <w:drawing>
           <wp:inline distT="0" distB="0" distL="0" distR="0" wp14:anchorId="105B0862" wp14:editId="0F5D568B">
             <wp:extent cx="1352739" cy="200053"/>
@@ -448,7 +455,7 @@
                     <pic:cNvPicPr/>
                   </pic:nvPicPr>
                   <pic:blipFill>
-                    <a:blip r:embed="rId11"/>
+                    <a:blip r:embed="rId12"/>
                     <a:stretch>
                       <a:fillRect/>
                     </a:stretch>
@@ -474,7 +481,6 @@
       <w:r>
         <w:t>La propiedad </w:t>
       </w:r>
-      <w:proofErr w:type="spellStart"/>
       <w:r>
         <w:rPr>
           <w:b/>
@@ -482,7 +488,6 @@
         </w:rPr>
         <w:t>flex</w:t>
       </w:r>
-      <w:proofErr w:type="spellEnd"/>
       <w:r>
         <w:t>-</w:t>
       </w:r>
@@ -499,6 +504,9 @@
     </w:p>
     <w:p>
       <w:r>
+        <w:rPr>
+          <w:noProof/>
+        </w:rPr>
         <w:drawing>
           <wp:inline distT="0" distB="0" distL="0" distR="0" wp14:anchorId="0B66DA64" wp14:editId="03D4D658">
             <wp:extent cx="1905266" cy="228632"/>
@@ -515,7 +523,7 @@
                     <pic:cNvPicPr/>
                   </pic:nvPicPr>
                   <pic:blipFill>
-                    <a:blip r:embed="rId12"/>
+                    <a:blip r:embed="rId13"/>
                     <a:stretch>
                       <a:fillRect/>
                     </a:stretch>
@@ -539,15 +547,7 @@
         <w:t xml:space="preserve"> </w:t>
       </w:r>
       <w:r>
-        <w:t xml:space="preserve">La propiedad </w:t>
-      </w:r>
-      <w:proofErr w:type="spellStart"/>
-      <w:r>
-        <w:t>justify-content</w:t>
-      </w:r>
-      <w:proofErr w:type="spellEnd"/>
-      <w:r>
-        <w:t> </w:t>
+        <w:t>La propiedad justify-content </w:t>
       </w:r>
       <w:r>
         <w:rPr>
@@ -562,6 +562,9 @@
     </w:p>
     <w:p>
       <w:r>
+        <w:rPr>
+          <w:noProof/>
+        </w:rPr>
         <w:drawing>
           <wp:inline distT="0" distB="0" distL="0" distR="0" wp14:anchorId="4D6152D9" wp14:editId="29B42EF7">
             <wp:extent cx="1552792" cy="190527"/>
@@ -578,7 +581,7 @@
                     <pic:cNvPicPr/>
                   </pic:nvPicPr>
                   <pic:blipFill>
-                    <a:blip r:embed="rId13"/>
+                    <a:blip r:embed="rId14"/>
                     <a:stretch>
                       <a:fillRect/>
                     </a:stretch>
@@ -617,6 +620,9 @@
     </w:p>
     <w:p>
       <w:r>
+        <w:rPr>
+          <w:noProof/>
+        </w:rPr>
         <w:drawing>
           <wp:inline distT="0" distB="0" distL="0" distR="0" wp14:anchorId="0569B8A9" wp14:editId="43DDD894">
             <wp:extent cx="1629002" cy="209579"/>
@@ -633,7 +639,7 @@
                     <pic:cNvPicPr/>
                   </pic:nvPicPr>
                   <pic:blipFill>
-                    <a:blip r:embed="rId14"/>
+                    <a:blip r:embed="rId15"/>
                     <a:stretch>
                       <a:fillRect/>
                     </a:stretch>
@@ -657,15 +663,7 @@
         <w:t xml:space="preserve"> </w:t>
       </w:r>
       <w:r>
-        <w:t xml:space="preserve">alinea los elementos flexibles de la línea flexible actual, reemplazando el valor de </w:t>
-      </w:r>
-      <w:proofErr w:type="spellStart"/>
-      <w:r>
-        <w:t>align-items</w:t>
-      </w:r>
-      <w:proofErr w:type="spellEnd"/>
-      <w:r>
-        <w:t>.</w:t>
+        <w:t>alinea los elementos flexibles de la línea flexible actual, reemplazando el valor de align-items.</w:t>
       </w:r>
     </w:p>
     <w:sectPr>
@@ -1281,6 +1279,7 @@
   <w:style w:type="character" w:default="1" w:styleId="Fuentedeprrafopredeter">
     <w:name w:val="Default Paragraph Font"/>
     <w:uiPriority w:val="1"/>
+    <w:semiHidden/>
     <w:unhideWhenUsed/>
   </w:style>
   <w:style w:type="table" w:default="1" w:styleId="Tablanormal">

</xml_diff>